<commit_message>
Confirm Chapter 17 integration tests fully live-verified
The blockers from the previous commit are now resolved: McAfee no longer
blocks the test assemblies, and a third real issue was found and fixed - the
"(localdb)\MSSQLLocalDB" alias fails intermittently on this machine with a
SQLUserInstance.dll/SNI error. IntegrationTestWebApplicationFactory now
resolves the LocalDB instance's actual named pipe at runtime via
`sqllocaldb info`, falling back to the alias if unavailable.

All 10 integration tests pass (~1s) and all 28 unit tests still pass.
Documentation (testing.md, Fortschritt.md, ProjektErstellung.docx) updated
from "pending" to "verified".

Co-Authored-By: Claude Sonnet 5 <noreply@anthropic.com>
</commit_message>
<xml_diff>
--- a/docs/prompt/ProjektErstellung.docx
+++ b/docs/prompt/ProjektErstellung.docx
@@ -3871,7 +3871,6 @@
           <w:color w:val="243447"/>
           <w:sz w:val="21"/>
         </w:rPr>
-        <w:lastRenderedPageBreak/>
         <w:t>keine Secrets im Git Repository</w:t>
       </w:r>
     </w:p>
@@ -4762,7 +4761,6 @@
           <w:color w:val="243447"/>
           <w:sz w:val="21"/>
         </w:rPr>
-        <w:lastRenderedPageBreak/>
         <w:t>Configuration</w:t>
       </w:r>
     </w:p>
@@ -5625,7 +5623,6 @@
           <w:color w:val="243447"/>
           <w:sz w:val="21"/>
         </w:rPr>
-        <w:lastRenderedPageBreak/>
         <w:t>nenne die verwendeten NuGet Packages und ihren Zweck</w:t>
       </w:r>
     </w:p>
@@ -6521,7 +6518,6 @@
           <w:color w:val="243447"/>
           <w:sz w:val="21"/>
         </w:rPr>
-        <w:lastRenderedPageBreak/>
         <w:t>SourceAccountId</w:t>
       </w:r>
     </w:p>
@@ -7407,7 +7403,6 @@
           <w:color w:val="243447"/>
           <w:sz w:val="21"/>
         </w:rPr>
-        <w:lastRenderedPageBreak/>
         <w:t>Transaction</w:t>
       </w:r>
     </w:p>
@@ -8300,7 +8295,6 @@
           <w:color w:val="243447"/>
           <w:sz w:val="21"/>
         </w:rPr>
-        <w:lastRenderedPageBreak/>
         <w:t>CreatePaymentCommand</w:t>
       </w:r>
       <w:r>
@@ -9078,7 +9072,6 @@
           <w:color w:val="243447"/>
           <w:sz w:val="21"/>
         </w:rPr>
-        <w:lastRenderedPageBreak/>
         <w:t>wann 404 verwendet wird</w:t>
       </w:r>
     </w:p>
@@ -9896,7 +9889,6 @@
           <w:color w:val="243447"/>
           <w:sz w:val="21"/>
         </w:rPr>
-        <w:lastRenderedPageBreak/>
         <w:t>Blazor Server</w:t>
       </w:r>
     </w:p>
@@ -10559,16 +10551,7 @@
           <w:color w:val="243447"/>
           <w:sz w:val="21"/>
         </w:rPr>
-        <w:t xml:space="preserve">Stattdessen verwenden wir: Microsoft.AspNetCore.Components.QuickGrid, eine offizielle, kostenlose Blazor-Komponente von Microsoft. Sie unterstützt Server-side Paging, Sorting und Filtering und ist ohne Lizenzabhängigkeit sofort einsatzbereit. Die Grid-Anforderungen aus diesem </w:t>
-      </w:r>
-      <w:r>
-        <w:rPr>
-          <w:rFonts w:ascii="Aptos" w:hAnsi="Aptos"/>
-          <w:color w:val="243447"/>
-          <w:sz w:val="21"/>
-        </w:rPr>
-        <w:lastRenderedPageBreak/>
-        <w:t>Kapitel (Server-side Paging, Sorting, Filtering, Detail View, keine Massenübertragung tausender Datensätze zum Browser) wurden damit vollständig umgesetzt.</w:t>
+        <w:t>Stattdessen verwenden wir: Microsoft.AspNetCore.Components.QuickGrid, eine offizielle, kostenlose Blazor-Komponente von Microsoft. Sie unterstützt Server-side Paging, Sorting und Filtering und ist ohne Lizenzabhängigkeit sofort einsatzbereit. Die Grid-Anforderungen aus diesem Kapitel (Server-side Paging, Sorting, Filtering, Detail View, keine Massenübertragung tausender Datensätze zum Browser) wurden damit vollständig umgesetzt.</w:t>
       </w:r>
     </w:p>
     <w:p>
@@ -16677,6 +16660,20 @@
           <w:rStyle w:val="Platzhaltertext"/>
         </w:rPr>
         <w:t>Beim Code-Review vor dem Commit (mangels Live-Testlauf besonders wichtig) zwei reale Fehler in der Testinfrastruktur selbst gefunden und behoben, bevor sie unbemerkt zu falsch-negativen bzw. falsch-positiven Tests geführt hätten: Program.cs liest ConnectionStrings/Jwt-Werte eager vor Build() - WebApplicationFactory-Konfigurationsüberschreibung kommt dafür zu spät, gelöst über Umgebungsvariablen statt ConfigureAppConfiguration. Zusätzlich fehlten im Testclient dieselben JSON-Optionen wie in der echten Api (JsonStringEnumConverter, StronglyTypedIdJsonConverterFactory) - ohne sie wären Ids/Enums in den Testantworten stillschweigend falsch deserialisiert worden. Details: docs/architecture/testing.md.</w:t>
+      </w:r>
+    </w:p>
+    <w:p>
+      <w:pPr>
+        <w:spacing w:after="120" w:line="242" w:lineRule="auto"/>
+        <w:rPr>
+          <w:rStyle w:val="Platzhaltertext"/>
+        </w:rPr>
+      </w:pPr>
+      <w:r>
+        <w:rPr>
+          <w:rStyle w:val="Platzhaltertext"/>
+        </w:rPr>
+        <w:t>Nachtrag: Live-Testlauf inzwischen erfolgreich nachgeholt. Alle 10 Integration Tests grün (dotnet test, ca. 1 Sekunde), inklusive echter Migration gegen eine frisch angelegte LocalDB-Datenbank. Dabei einen dritten, rein umgebungsbedingten Fehler gefunden und behoben: der Alias "(localdb)\MSSQLLocalDB" schlägt auf dieser Maschine wiederkehrend fehl - die Factory löst stattdessen die aktuell aktive Named Pipe der LocalDB-Instanz zur Laufzeit auf. Details: docs/architecture/testing.md.</w:t>
       </w:r>
     </w:p>
     <w:p>

</xml_diff>